<commit_message>
Update A-1 fixture company details
</commit_message>
<xml_diff>
--- a/tests/fixtures/templates/a1_proposal_template.docx
+++ b/tests/fixtures/templates/a1_proposal_template.docx
@@ -2,6 +2,27 @@
 <file path=word/document.xml><?xml version="1.0" encoding="utf-8"?>
 <w:document xmlns:w="http://schemas.openxmlformats.org/wordprocessingml/2006/main">
   <w:body>
+    <w:p>
+      <w:r>
+        <w:t xml:space="preserve">A-1 Tank Removal LLC</w:t>
+      </w:r>
+    </w:p>
+    <w:p>
+      <w:r>
+        <w:t xml:space="preserve">W178 N6006 Prairie Sky Court</w:t>
+      </w:r>
+    </w:p>
+    <w:p>
+      <w:r>
+        <w:t xml:space="preserve">Menomonee Falls, Wisconsin 53051</w:t>
+      </w:r>
+    </w:p>
+    <w:p>
+      <w:r>
+        <w:t xml:space="preserve">(262) 252-4030</w:t>
+      </w:r>
+    </w:p>
+    <w:p/>
     <w:p>
       <w:r>
         <w:t xml:space="preserve">A-1 Tank Removal Proposal</w:t>
@@ -79,6 +100,22 @@
         <w:t xml:space="preserve">{{notes}}</w:t>
       </w:r>
     </w:p>
+    <w:p>
+      <w:r>
+        <w:t xml:space="preserve">Payment due upon completion</w:t>
+      </w:r>
+    </w:p>
+    <w:p>
+      <w:r>
+        <w:t xml:space="preserve">Proposal Accepted By:</w:t>
+      </w:r>
+    </w:p>
+    <w:p/>
+    <w:p>
+      <w:r>
+        <w:t xml:space="preserve">Signature: ________________________________</w:t>
+      </w:r>
+    </w:p>
     <w:sectPr>
       <w:pgSz w:w="12240" w:h="15840"/>
       <w:pgMar w:top="1440" w:right="1440" w:bottom="1440" w:left="1440" w:header="720" w:footer="720" w:gutter="0"/>

</xml_diff>